<commit_message>
Reword conclusion on cost explanation
</commit_message>
<xml_diff>
--- a/revision/06_submission_manuscript.docx
+++ b/revision/06_submission_manuscript.docx
@@ -120,7 +120,7 @@
         <w:pStyle w:val="FirstParagraph"/>
       </w:pPr>
       <w:r>
-        <w:t xml:space="preserve">Southeast Asian governments have made artificial intelligence (AI) a pillar of industrial policy, but little is known about which domestic firms their incentive rules admit to the AI stack. We code 29 instruments from the legal texts of Thailand, Vietnam, Malaysia and the Philippines, place their capital thresholds on a common cost scale, and test three explanations: cost necessity, scale-favouring design and administrative habit. The four systems use different architectures: capital-gated activities, two parallel tracks, a strategic-technology list and activity tiers with a common firm-scale boundary. All make application-layer support accessible to small firms. At the compute layers, Thailand’s gates lie two to three orders of magnitude above the capital to host one server but about one order or less above the fleet a provider-economics benchmark finds viable, and Malaysia’s data-centre track starts at 0.85 MW. Where small cloud providers can enter on paper, the screen is a fixed compliance cost. Vietnam and the Philippines state no capital rule. No instrument is aimed at provision below facility scale. Cost explains Thailand’s gate better than we expected but not the pattern across countries. The evidence concerns eligibility, not realised access, and does not show a middle-technology trap.</w:t>
+        <w:t xml:space="preserve">Southeast Asian governments have made artificial intelligence (AI) a pillar of industrial policy, but little is known about which domestic firms their incentive rules admit to the AI stack. We code 29 instruments from the legal texts of Thailand, Vietnam, Malaysia and the Philippines, place their capital thresholds on a common cost scale, and test three explanations: cost necessity, scale-favouring design and administrative habit. The four systems use different architectures: capital-gated activities, two parallel tracks, a strategic-technology list and activity tiers with a common firm-scale boundary. All make application-layer support accessible to small firms. At the compute layers, Thailand’s gates lie two to three orders of magnitude above the capital to host one server but about one order or less above the fleet a provider-economics benchmark finds viable, and Malaysia’s data-centre track starts at 0.85 MW. Where small cloud providers can enter on paper, the screen is a fixed compliance cost. Vietnam and the Philippines state no capital rule. No instrument is aimed at provision below facility scale. Cost largely explains Thailand’s gate but not the pattern across countries. The evidence concerns eligibility, not realised access, and does not show a middle-technology trap.</w:t>
       </w:r>
     </w:p>
     <w:p>
@@ -4508,7 +4508,7 @@
         <w:pStyle w:val="FirstParagraph"/>
       </w:pPr>
       <w:r>
-        <w:t xml:space="preserve">This paper asked where four Southeast Asian incentive systems screen entrants to the AI industry. All four make application development accessible on the stated thresholds, and Vietnam adds a startup track with direct equity access. Above that layer they use four architectures. Thailand gates data centres by capacity and GPU hosting by capital, 1.7 to 3.0 orders of magnitude above one server but at most one order above the fleet a benchmark finds viable at central prices, while cloud services carry certification in place of capital. Malaysia runs a low-capital digital track covering cloud beside a data-centre track starting at 0.85 MW. Vietnam lists strategic technologies without ranking them and states no capital rule. The Philippines lists activities by tier and applies one firm-scale boundary to all. No instrument we coded is aimed at compute provision below facility scale. Cost explains Thailand’s gate better than we expected, but not why Vietnam and the Philippines need no capital gate, why Malaysia can run a low-capital cloud track or why Thailand’s research tier presupposes sales. The evidence concerns eligibility, not access, and does not show that any of the four is in a middle-technology trap. The next steps are to measure the prices and utilisation that small regional providers actually obtain, code the general schemes, and link rules to firm-level take-up.</w:t>
+        <w:t xml:space="preserve">This paper asked where four Southeast Asian incentive systems screen entrants to the AI industry. All four make application development accessible on the stated thresholds, and Vietnam adds a startup track with direct equity access. Above that layer they use four architectures. Thailand gates data centres by capacity and GPU hosting by capital, 1.7 to 3.0 orders of magnitude above one server but at most one order above the fleet a benchmark finds viable at central prices, while cloud services carry certification in place of capital. Malaysia runs a low-capital digital track covering cloud beside a data-centre track starting at 0.85 MW. Vietnam lists strategic technologies without ranking them and states no capital rule. The Philippines lists activities by tier and applies one firm-scale boundary to all. No instrument we coded is aimed at compute provision below facility scale. Cost largely explains Thailand’s gate, but not why Vietnam and the Philippines need no capital gate, why Malaysia can run a low-capital cloud track or why Thailand’s research tier presupposes sales. The evidence concerns eligibility, not access, and does not show that any of the four is in a middle-technology trap. The next steps are to measure the prices and utilisation that small regional providers actually obtain, code the general schemes, and link rules to firm-level take-up.</w:t>
       </w:r>
     </w:p>
     <w:bookmarkEnd w:id="47"/>

</xml_diff>

<commit_message>
Add funding and competing-interest statements
</commit_message>
<xml_diff>
--- a/revision/06_submission_manuscript.docx
+++ b/revision/06_submission_manuscript.docx
@@ -4368,13 +4368,13 @@
       </w:r>
     </w:p>
     <w:bookmarkEnd w:id="47"/>
-    <w:bookmarkStart w:id="48" w:name="acknowledgments"/>
+    <w:bookmarkStart w:id="48" w:name="declaration-of-interest-statement"/>
     <w:p>
       <w:pPr>
         <w:pStyle w:val="Heading2"/>
       </w:pPr>
       <w:r>
-        <w:t xml:space="preserve">Acknowledgments</w:t>
+        <w:t xml:space="preserve">Declaration of interest statement</w:t>
       </w:r>
     </w:p>
     <w:p>
@@ -4382,17 +4382,17 @@
         <w:pStyle w:val="FirstParagraph"/>
       </w:pPr>
       <w:r>
-        <w:t xml:space="preserve">[AUTHORS TO COMPLETE.]</w:t>
+        <w:t xml:space="preserve">The authors report there are no competing interests to declare.</w:t>
       </w:r>
     </w:p>
     <w:bookmarkEnd w:id="48"/>
-    <w:bookmarkStart w:id="49" w:name="declaration-of-interest-statement"/>
+    <w:bookmarkStart w:id="49" w:name="funding"/>
     <w:p>
       <w:pPr>
         <w:pStyle w:val="Heading2"/>
       </w:pPr>
       <w:r>
-        <w:t xml:space="preserve">Declaration of interest statement</w:t>
+        <w:t xml:space="preserve">Funding</w:t>
       </w:r>
     </w:p>
     <w:p>
@@ -4400,17 +4400,17 @@
         <w:pStyle w:val="FirstParagraph"/>
       </w:pPr>
       <w:r>
-        <w:t xml:space="preserve">[AUTHORS TO COMPLETE: the authors report no conflict of interest, or state any.]</w:t>
+        <w:t xml:space="preserve">No funding was obtained for the reported work.</w:t>
       </w:r>
     </w:p>
     <w:bookmarkEnd w:id="49"/>
-    <w:bookmarkStart w:id="50" w:name="funding"/>
+    <w:bookmarkStart w:id="50" w:name="declaration-of-generative-ai-use"/>
     <w:p>
       <w:pPr>
         <w:pStyle w:val="Heading2"/>
       </w:pPr>
       <w:r>
-        <w:t xml:space="preserve">Funding</w:t>
+        <w:t xml:space="preserve">Declaration of generative AI use</w:t>
       </w:r>
     </w:p>
     <w:p>
@@ -4418,44 +4418,11 @@
         <w:pStyle w:val="FirstParagraph"/>
       </w:pPr>
       <w:r>
-        <w:t xml:space="preserve">[AUTHORS TO COMPLETE: funding details, or</w:t>
-      </w:r>
-      <w:r>
-        <w:t xml:space="preserve"> </w:t>
-      </w:r>
-      <w:r>
-        <w:t xml:space="preserve">“</w:t>
-      </w:r>
-      <w:r>
-        <w:t xml:space="preserve">No funding was obtained for the reported work.</w:t>
-      </w:r>
-      <w:r>
-        <w:t xml:space="preserve">”</w:t>
-      </w:r>
-      <w:r>
-        <w:t xml:space="preserve">]</w:t>
+        <w:t xml:space="preserve">The authors used generative AI to polish the writing of this manuscript and, as a blind second coder, to check the coding of legal instruments (Section 3.2). The authors reviewed and edited the text and take full responsibility for the content.</w:t>
       </w:r>
     </w:p>
     <w:bookmarkEnd w:id="50"/>
-    <w:bookmarkStart w:id="51" w:name="declaration-of-generative-ai-use"/>
-    <w:p>
-      <w:pPr>
-        <w:pStyle w:val="Heading2"/>
-      </w:pPr>
-      <w:r>
-        <w:t xml:space="preserve">Declaration of generative AI use</w:t>
-      </w:r>
-    </w:p>
-    <w:p>
-      <w:pPr>
-        <w:pStyle w:val="FirstParagraph"/>
-      </w:pPr>
-      <w:r>
-        <w:t xml:space="preserve">The authors used generative AI to polish the writing of this manuscript and, as a blind second coder, to check the coding of legal instruments (Section 3.2). The authors reviewed and edited the text and take full responsibility for the content.</w:t>
-      </w:r>
-    </w:p>
-    <w:bookmarkEnd w:id="51"/>
-    <w:bookmarkStart w:id="52" w:name="references"/>
+    <w:bookmarkStart w:id="51" w:name="references"/>
     <w:p>
       <w:pPr>
         <w:pStyle w:val="Heading2"/>
@@ -5232,7 +5199,7 @@
         <w:t xml:space="preserve">(1), 11.</w:t>
       </w:r>
     </w:p>
-    <w:bookmarkEnd w:id="52"/>
+    <w:bookmarkEnd w:id="51"/>
     <w:sectPr>
       <w:pgMar w:left="1247" w:right="1247"/>
     </w:sectPr>

</xml_diff>